<commit_message>
Ata de acordo e adição da conclusão
</commit_message>
<xml_diff>
--- a/AtaAcordo-SemParceiroExterno.docx
+++ b/AtaAcordo-SemParceiroExterno.docx
@@ -1,6 +1,6 @@
 
 <file path=word/document.xml><?xml version="1.0" encoding="utf-8"?>
-<w:document xmlns:wpc="http://schemas.microsoft.com/office/word/2010/wordprocessingCanvas" xmlns:mo="http://schemas.microsoft.com/office/mac/office/2008/main" xmlns:mc="http://schemas.openxmlformats.org/markup-compatibility/2006" xmlns:mv="urn:schemas-microsoft-com:mac:vml" xmlns:o="urn:schemas-microsoft-com:office:office" xmlns:r="http://schemas.openxmlformats.org/officeDocument/2006/relationships" xmlns:m="http://schemas.openxmlformats.org/officeDocument/2006/math" xmlns:v="urn:schemas-microsoft-com:vml" xmlns:wp14="http://schemas.microsoft.com/office/word/2010/wordprocessingDrawing" xmlns:wp="http://schemas.openxmlformats.org/drawingml/2006/wordprocessingDrawing" xmlns:w10="urn:schemas-microsoft-com:office:word" xmlns:w="http://schemas.openxmlformats.org/wordprocessingml/2006/main" xmlns:w14="http://schemas.microsoft.com/office/word/2010/wordml" xmlns:wpg="http://schemas.microsoft.com/office/word/2010/wordprocessingGroup" xmlns:wpi="http://schemas.microsoft.com/office/word/2010/wordprocessingInk" xmlns:wne="http://schemas.microsoft.com/office/word/2006/wordml" xmlns:wps="http://schemas.microsoft.com/office/word/2010/wordprocessingShape" mc:Ignorable="w14 wp14">
+<w:document xmlns:ve="http://schemas.openxmlformats.org/markup-compatibility/2006" xmlns:o="urn:schemas-microsoft-com:office:office" xmlns:r="http://schemas.openxmlformats.org/officeDocument/2006/relationships" xmlns:m="http://schemas.openxmlformats.org/officeDocument/2006/math" xmlns:v="urn:schemas-microsoft-com:vml" xmlns:wp="http://schemas.openxmlformats.org/drawingml/2006/wordprocessingDrawing" xmlns:w10="urn:schemas-microsoft-com:office:word" xmlns:w="http://schemas.openxmlformats.org/wordprocessingml/2006/main" xmlns:wne="http://schemas.microsoft.com/office/word/2006/wordml">
   <w:body>
     <w:p>
       <w:pPr>
@@ -68,9 +68,16 @@
           <w:rFonts w:ascii="Arial" w:hAnsi="Arial" w:cs="Arial"/>
           <w:sz w:val="20"/>
           <w:szCs w:val="20"/>
-          <w:highlight w:val="yellow"/>
-        </w:rPr>
-        <w:t>XX</w:t>
+        </w:rPr>
+        <w:t>1</w:t>
+      </w:r>
+      <w:r>
+        <w:rPr>
+          <w:rFonts w:ascii="Arial" w:hAnsi="Arial" w:cs="Arial"/>
+          <w:sz w:val="20"/>
+          <w:szCs w:val="20"/>
+        </w:rPr>
+        <w:t>7</w:t>
       </w:r>
       <w:r>
         <w:rPr>
@@ -90,7 +97,6 @@
         </w:rPr>
         <w:t xml:space="preserve">horas do dia </w:t>
       </w:r>
-      <w:proofErr w:type="spellStart"/>
       <w:r>
         <w:rPr>
           <w:rFonts w:ascii="Arial" w:hAnsi="Arial" w:cs="Arial"/>
@@ -98,11 +104,9 @@
           <w:bCs/>
           <w:sz w:val="20"/>
           <w:szCs w:val="20"/>
-          <w:highlight w:val="yellow"/>
-        </w:rPr>
-        <w:t>DIA</w:t>
-      </w:r>
-      <w:proofErr w:type="spellEnd"/>
+        </w:rPr>
+        <w:t>30</w:t>
+      </w:r>
       <w:r>
         <w:rPr>
           <w:rFonts w:ascii="Arial" w:hAnsi="Arial" w:cs="Arial"/>
@@ -127,9 +131,8 @@
           <w:b/>
           <w:sz w:val="20"/>
           <w:szCs w:val="20"/>
-          <w:highlight w:val="yellow"/>
-        </w:rPr>
-        <w:t>MÊS</w:t>
+        </w:rPr>
+        <w:t>junho</w:t>
       </w:r>
       <w:r>
         <w:rPr>
@@ -161,9 +164,8 @@
           <w:b/>
           <w:sz w:val="20"/>
           <w:szCs w:val="20"/>
-          <w:highlight w:val="yellow"/>
-        </w:rPr>
-        <w:t>ANO</w:t>
+        </w:rPr>
+        <w:t>2026</w:t>
       </w:r>
       <w:r>
         <w:rPr>
@@ -330,12 +332,10 @@
         <w:rPr>
           <w:rFonts w:ascii="Arial" w:hAnsi="Arial" w:cs="Arial"/>
           <w:b/>
-          <w:bCs/>
-          <w:sz w:val="20"/>
-          <w:szCs w:val="20"/>
-          <w:highlight w:val="yellow"/>
-        </w:rPr>
-        <w:t>NOME DA DISCIPLINA</w:t>
+          <w:sz w:val="20"/>
+          <w:szCs w:val="20"/>
+        </w:rPr>
+        <w:t>Trabalho Interdisciplinar: Aplicações para Processos de Negócios</w:t>
       </w:r>
       <w:r>
         <w:rPr>
@@ -449,9 +449,8 @@
           <w:color w:val="000000" w:themeColor="text1"/>
           <w:sz w:val="19"/>
           <w:szCs w:val="19"/>
-          <w:highlight w:val="yellow"/>
-        </w:rPr>
-        <w:t>NOME DO CURSO</w:t>
+        </w:rPr>
+        <w:t>Engenharia de Software</w:t>
       </w:r>
       <w:r>
         <w:rPr>
@@ -517,6 +516,63 @@
         </w:rPr>
         <w:t xml:space="preserve"> </w:t>
       </w:r>
+      <w:proofErr w:type="spellStart"/>
+      <w:r>
+        <w:rPr>
+          <w:rFonts w:ascii="Arial" w:hAnsi="Arial" w:cs="Arial"/>
+          <w:b/>
+          <w:sz w:val="20"/>
+          <w:szCs w:val="20"/>
+        </w:rPr>
+        <w:t>Cleia</w:t>
+      </w:r>
+      <w:proofErr w:type="spellEnd"/>
+      <w:r>
+        <w:rPr>
+          <w:rFonts w:ascii="Arial" w:hAnsi="Arial" w:cs="Arial"/>
+          <w:b/>
+          <w:sz w:val="20"/>
+          <w:szCs w:val="20"/>
+        </w:rPr>
+        <w:t xml:space="preserve"> </w:t>
+      </w:r>
+      <w:proofErr w:type="spellStart"/>
+      <w:r>
+        <w:rPr>
+          <w:rFonts w:ascii="Arial" w:hAnsi="Arial" w:cs="Arial"/>
+          <w:b/>
+          <w:sz w:val="20"/>
+          <w:szCs w:val="20"/>
+        </w:rPr>
+        <w:t>Marcia</w:t>
+      </w:r>
+      <w:proofErr w:type="spellEnd"/>
+      <w:r>
+        <w:rPr>
+          <w:rFonts w:ascii="Arial" w:hAnsi="Arial" w:cs="Arial"/>
+          <w:b/>
+          <w:sz w:val="20"/>
+          <w:szCs w:val="20"/>
+        </w:rPr>
+        <w:t xml:space="preserve"> Gomes Amaral </w:t>
+      </w:r>
+      <w:r>
+        <w:rPr>
+          <w:rFonts w:ascii="Arial" w:hAnsi="Arial" w:cs="Arial"/>
+          <w:sz w:val="20"/>
+          <w:szCs w:val="20"/>
+        </w:rPr>
+        <w:t>e</w:t>
+      </w:r>
+      <w:r>
+        <w:rPr>
+          <w:rFonts w:ascii="Arial" w:hAnsi="Arial" w:cs="Arial"/>
+          <w:b/>
+          <w:sz w:val="20"/>
+          <w:szCs w:val="20"/>
+        </w:rPr>
+        <w:t xml:space="preserve"> Joana Gabriela Ribeiro de Souza</w:t>
+      </w:r>
       <w:r>
         <w:rPr>
           <w:rFonts w:ascii="Arial" w:hAnsi="Arial" w:cs="Arial"/>
@@ -524,9 +580,170 @@
           <w:bCs/>
           <w:sz w:val="20"/>
           <w:szCs w:val="20"/>
-          <w:highlight w:val="yellow"/>
-        </w:rPr>
-        <w:t>NOME</w:t>
+        </w:rPr>
+        <w:t>,</w:t>
+      </w:r>
+      <w:r>
+        <w:rPr>
+          <w:rFonts w:ascii="Arial" w:hAnsi="Arial" w:cs="Arial"/>
+          <w:sz w:val="20"/>
+          <w:szCs w:val="20"/>
+        </w:rPr>
+        <w:t xml:space="preserve"> professor</w:t>
+      </w:r>
+      <w:r>
+        <w:rPr>
+          <w:rFonts w:ascii="Arial" w:hAnsi="Arial" w:cs="Arial"/>
+          <w:sz w:val="20"/>
+          <w:szCs w:val="20"/>
+        </w:rPr>
+        <w:t>e</w:t>
+      </w:r>
+      <w:r>
+        <w:rPr>
+          <w:rFonts w:ascii="Arial" w:hAnsi="Arial" w:cs="Arial"/>
+          <w:sz w:val="20"/>
+          <w:szCs w:val="20"/>
+        </w:rPr>
+        <w:t>s</w:t>
+      </w:r>
+      <w:r>
+        <w:rPr>
+          <w:rFonts w:ascii="Arial" w:hAnsi="Arial" w:cs="Arial"/>
+          <w:sz w:val="20"/>
+          <w:szCs w:val="20"/>
+        </w:rPr>
+        <w:t xml:space="preserve"> da unidade curricular</w:t>
+      </w:r>
+      <w:r>
+        <w:rPr>
+          <w:rFonts w:ascii="Arial" w:hAnsi="Arial" w:cs="Arial"/>
+          <w:sz w:val="20"/>
+          <w:szCs w:val="20"/>
+        </w:rPr>
+        <w:t>,</w:t>
+      </w:r>
+      <w:r>
+        <w:rPr>
+          <w:rFonts w:ascii="Arial" w:hAnsi="Arial" w:cs="Arial"/>
+          <w:sz w:val="20"/>
+          <w:szCs w:val="20"/>
+        </w:rPr>
+        <w:t xml:space="preserve"> e</w:t>
+      </w:r>
+      <w:r>
+        <w:rPr>
+          <w:rFonts w:ascii="Arial" w:hAnsi="Arial" w:cs="Arial"/>
+          <w:sz w:val="20"/>
+          <w:szCs w:val="20"/>
+        </w:rPr>
+        <w:t xml:space="preserve"> </w:t>
+      </w:r>
+      <w:r>
+        <w:rPr>
+          <w:rFonts w:ascii="Arial" w:hAnsi="Arial" w:cs="Arial"/>
+          <w:b/>
+          <w:sz w:val="20"/>
+          <w:szCs w:val="20"/>
+        </w:rPr>
+        <w:t xml:space="preserve">Arthur Henrique Figueiredo </w:t>
+      </w:r>
+      <w:proofErr w:type="spellStart"/>
+      <w:r>
+        <w:rPr>
+          <w:rFonts w:ascii="Arial" w:hAnsi="Arial" w:cs="Arial"/>
+          <w:b/>
+          <w:sz w:val="20"/>
+          <w:szCs w:val="20"/>
+        </w:rPr>
+        <w:t>Cayres</w:t>
+      </w:r>
+      <w:proofErr w:type="spellEnd"/>
+      <w:r>
+        <w:rPr>
+          <w:rFonts w:ascii="Arial" w:hAnsi="Arial" w:cs="Arial"/>
+          <w:b/>
+          <w:sz w:val="20"/>
+          <w:szCs w:val="20"/>
+        </w:rPr>
+        <w:t xml:space="preserve"> </w:t>
+      </w:r>
+      <w:proofErr w:type="spellStart"/>
+      <w:r>
+        <w:rPr>
+          <w:rFonts w:ascii="Arial" w:hAnsi="Arial" w:cs="Arial"/>
+          <w:b/>
+          <w:sz w:val="20"/>
+          <w:szCs w:val="20"/>
+        </w:rPr>
+        <w:t>Burdignon</w:t>
+      </w:r>
+      <w:proofErr w:type="spellEnd"/>
+      <w:r>
+        <w:rPr>
+          <w:rFonts w:ascii="Arial" w:hAnsi="Arial" w:cs="Arial"/>
+          <w:b/>
+          <w:sz w:val="20"/>
+          <w:szCs w:val="20"/>
+        </w:rPr>
+        <w:t xml:space="preserve">, Arthur </w:t>
+      </w:r>
+      <w:proofErr w:type="spellStart"/>
+      <w:r>
+        <w:rPr>
+          <w:rFonts w:ascii="Arial" w:hAnsi="Arial" w:cs="Arial"/>
+          <w:b/>
+          <w:sz w:val="20"/>
+          <w:szCs w:val="20"/>
+        </w:rPr>
+        <w:t>Jansen</w:t>
+      </w:r>
+      <w:proofErr w:type="spellEnd"/>
+      <w:r>
+        <w:rPr>
+          <w:rFonts w:ascii="Arial" w:hAnsi="Arial" w:cs="Arial"/>
+          <w:b/>
+          <w:sz w:val="20"/>
+          <w:szCs w:val="20"/>
+        </w:rPr>
+        <w:t xml:space="preserve"> Oliveira, Bruna Pedrosa Nunes, Lucas Gonçalves </w:t>
+      </w:r>
+      <w:proofErr w:type="spellStart"/>
+      <w:r>
+        <w:rPr>
+          <w:rFonts w:ascii="Arial" w:hAnsi="Arial" w:cs="Arial"/>
+          <w:b/>
+          <w:sz w:val="20"/>
+          <w:szCs w:val="20"/>
+        </w:rPr>
+        <w:t>Sivolella</w:t>
+      </w:r>
+      <w:proofErr w:type="spellEnd"/>
+      <w:r>
+        <w:rPr>
+          <w:rFonts w:ascii="Arial" w:hAnsi="Arial" w:cs="Arial"/>
+          <w:b/>
+          <w:sz w:val="20"/>
+          <w:szCs w:val="20"/>
+        </w:rPr>
+        <w:t xml:space="preserve"> </w:t>
+      </w:r>
+      <w:r>
+        <w:rPr>
+          <w:rFonts w:ascii="Arial" w:hAnsi="Arial" w:cs="Arial"/>
+          <w:sz w:val="20"/>
+          <w:szCs w:val="20"/>
+        </w:rPr>
+        <w:t>e</w:t>
+      </w:r>
+      <w:r>
+        <w:rPr>
+          <w:rFonts w:ascii="Arial" w:hAnsi="Arial" w:cs="Arial"/>
+          <w:b/>
+          <w:sz w:val="20"/>
+          <w:szCs w:val="20"/>
+        </w:rPr>
+        <w:t xml:space="preserve"> Vinicius Ramos Sales</w:t>
       </w:r>
       <w:r>
         <w:rPr>
@@ -535,46 +752,16 @@
           <w:bCs/>
           <w:sz w:val="20"/>
           <w:szCs w:val="20"/>
-          <w:highlight w:val="yellow"/>
-        </w:rPr>
-        <w:t>S</w:t>
-      </w:r>
-      <w:r>
-        <w:rPr>
-          <w:rFonts w:ascii="Arial" w:hAnsi="Arial" w:cs="Arial"/>
-          <w:b/>
-          <w:bCs/>
-          <w:sz w:val="20"/>
-          <w:szCs w:val="20"/>
-          <w:highlight w:val="yellow"/>
-        </w:rPr>
-        <w:t xml:space="preserve"> DOS DOCENTES</w:t>
-      </w:r>
-      <w:r>
-        <w:rPr>
-          <w:rFonts w:ascii="Arial" w:hAnsi="Arial" w:cs="Arial"/>
-          <w:b/>
-          <w:bCs/>
-          <w:sz w:val="20"/>
-          <w:szCs w:val="20"/>
-        </w:rPr>
-        <w:t>,</w:t>
-      </w:r>
-      <w:r>
-        <w:rPr>
-          <w:rFonts w:ascii="Arial" w:hAnsi="Arial" w:cs="Arial"/>
-          <w:sz w:val="20"/>
-          <w:szCs w:val="20"/>
-        </w:rPr>
-        <w:t xml:space="preserve"> professor</w:t>
-      </w:r>
-      <w:r>
-        <w:rPr>
-          <w:rFonts w:ascii="Arial" w:hAnsi="Arial" w:cs="Arial"/>
-          <w:sz w:val="20"/>
-          <w:szCs w:val="20"/>
-        </w:rPr>
-        <w:t>e</w:t>
+        </w:rPr>
+        <w:t xml:space="preserve">, </w:t>
+      </w:r>
+      <w:r>
+        <w:rPr>
+          <w:rFonts w:ascii="Arial" w:hAnsi="Arial" w:cs="Arial"/>
+          <w:sz w:val="20"/>
+          <w:szCs w:val="20"/>
+        </w:rPr>
+        <w:t>discente</w:t>
       </w:r>
       <w:r>
         <w:rPr>
@@ -590,86 +777,6 @@
           <w:sz w:val="20"/>
           <w:szCs w:val="20"/>
         </w:rPr>
-        <w:t xml:space="preserve"> da unidade curricular</w:t>
-      </w:r>
-      <w:r>
-        <w:rPr>
-          <w:rFonts w:ascii="Arial" w:hAnsi="Arial" w:cs="Arial"/>
-          <w:sz w:val="20"/>
-          <w:szCs w:val="20"/>
-        </w:rPr>
-        <w:t>,</w:t>
-      </w:r>
-      <w:r>
-        <w:rPr>
-          <w:rFonts w:ascii="Arial" w:hAnsi="Arial" w:cs="Arial"/>
-          <w:sz w:val="20"/>
-          <w:szCs w:val="20"/>
-        </w:rPr>
-        <w:t xml:space="preserve"> e</w:t>
-      </w:r>
-      <w:r>
-        <w:rPr>
-          <w:rFonts w:ascii="Arial" w:hAnsi="Arial" w:cs="Arial"/>
-          <w:sz w:val="20"/>
-          <w:szCs w:val="20"/>
-        </w:rPr>
-        <w:t xml:space="preserve"> </w:t>
-      </w:r>
-      <w:r>
-        <w:rPr>
-          <w:rFonts w:ascii="Arial" w:hAnsi="Arial" w:cs="Arial"/>
-          <w:b/>
-          <w:bCs/>
-          <w:sz w:val="20"/>
-          <w:szCs w:val="20"/>
-          <w:highlight w:val="yellow"/>
-        </w:rPr>
-        <w:t xml:space="preserve">NOMES DOS </w:t>
-      </w:r>
-      <w:r>
-        <w:rPr>
-          <w:rFonts w:ascii="Arial" w:hAnsi="Arial" w:cs="Arial"/>
-          <w:b/>
-          <w:bCs/>
-          <w:sz w:val="20"/>
-          <w:szCs w:val="20"/>
-          <w:highlight w:val="yellow"/>
-        </w:rPr>
-        <w:t>DICENTES</w:t>
-      </w:r>
-      <w:r>
-        <w:rPr>
-          <w:rFonts w:ascii="Arial" w:hAnsi="Arial" w:cs="Arial"/>
-          <w:b/>
-          <w:bCs/>
-          <w:sz w:val="20"/>
-          <w:szCs w:val="20"/>
-        </w:rPr>
-        <w:t xml:space="preserve">, </w:t>
-      </w:r>
-      <w:r>
-        <w:rPr>
-          <w:rFonts w:ascii="Arial" w:hAnsi="Arial" w:cs="Arial"/>
-          <w:sz w:val="20"/>
-          <w:szCs w:val="20"/>
-        </w:rPr>
-        <w:t>discente</w:t>
-      </w:r>
-      <w:r>
-        <w:rPr>
-          <w:rFonts w:ascii="Arial" w:hAnsi="Arial" w:cs="Arial"/>
-          <w:sz w:val="20"/>
-          <w:szCs w:val="20"/>
-        </w:rPr>
-        <w:t>s</w:t>
-      </w:r>
-      <w:r>
-        <w:rPr>
-          <w:rFonts w:ascii="Arial" w:hAnsi="Arial" w:cs="Arial"/>
-          <w:sz w:val="20"/>
-          <w:szCs w:val="20"/>
-        </w:rPr>
         <w:t xml:space="preserve"> </w:t>
       </w:r>
       <w:r>
@@ -686,7 +793,16 @@
           <w:sz w:val="20"/>
           <w:szCs w:val="20"/>
         </w:rPr>
-        <w:t>a unidade curricular</w:t>
+        <w:t xml:space="preserve">a unidade </w:t>
+      </w:r>
+      <w:proofErr w:type="gramStart"/>
+      <w:r>
+        <w:rPr>
+          <w:rFonts w:ascii="Arial" w:hAnsi="Arial" w:cs="Arial"/>
+          <w:sz w:val="20"/>
+          <w:szCs w:val="20"/>
+        </w:rPr>
+        <w:t>curricular</w:t>
       </w:r>
       <w:r>
         <w:rPr>
@@ -705,6 +821,7 @@
         </w:rPr>
         <w:t>software</w:t>
       </w:r>
+      <w:proofErr w:type="gramEnd"/>
       <w:r>
         <w:rPr>
           <w:rFonts w:ascii="Arial" w:hAnsi="Arial" w:cs="Arial"/>
@@ -1267,9 +1384,8 @@
           <w:color w:val="000000" w:themeColor="text1"/>
           <w:sz w:val="19"/>
           <w:szCs w:val="19"/>
-          <w:highlight w:val="yellow"/>
-        </w:rPr>
-        <w:t>NOME DO CURSO</w:t>
+        </w:rPr>
+        <w:t>Engenharia de Software</w:t>
       </w:r>
       <w:r>
         <w:rPr>
@@ -1734,7 +1850,7 @@
         <w:spacing w:line="360" w:lineRule="auto"/>
         <w:jc w:val="both"/>
         <w:rPr>
-          <w:rFonts w:ascii="Arial" w:eastAsia="Arial" w:hAnsi="Arial" w:cs="Arial"/>
+          <w:rFonts w:ascii="Arial" w:hAnsi="Arial" w:cs="Arial"/>
           <w:sz w:val="20"/>
           <w:szCs w:val="20"/>
         </w:rPr>
@@ -1771,9 +1887,8 @@
           <w:rFonts w:ascii="Arial" w:hAnsi="Arial" w:cs="Arial"/>
           <w:sz w:val="20"/>
           <w:szCs w:val="20"/>
-          <w:highlight w:val="yellow"/>
-        </w:rPr>
-        <w:t>DIA</w:t>
+        </w:rPr>
+        <w:t>30</w:t>
       </w:r>
       <w:r>
         <w:rPr>
@@ -1796,9 +1911,8 @@
           <w:rFonts w:ascii="Arial" w:hAnsi="Arial" w:cs="Arial"/>
           <w:sz w:val="20"/>
           <w:szCs w:val="20"/>
-          <w:highlight w:val="yellow"/>
-        </w:rPr>
-        <w:t>MÊS</w:t>
+        </w:rPr>
+        <w:t>junho</w:t>
       </w:r>
       <w:r>
         <w:rPr>
@@ -1821,9 +1935,8 @@
           <w:rFonts w:ascii="Arial" w:hAnsi="Arial" w:cs="Arial"/>
           <w:sz w:val="20"/>
           <w:szCs w:val="20"/>
-          <w:highlight w:val="yellow"/>
-        </w:rPr>
-        <w:t>ANO</w:t>
+        </w:rPr>
+        <w:t>2026</w:t>
       </w:r>
       <w:r>
         <w:rPr>
@@ -1832,46 +1945,6 @@
           <w:szCs w:val="20"/>
         </w:rPr>
         <w:t>.</w:t>
-      </w:r>
-    </w:p>
-    <w:p>
-      <w:pPr>
-        <w:spacing w:line="360" w:lineRule="auto"/>
-        <w:jc w:val="both"/>
-        <w:rPr>
-          <w:rFonts w:ascii="Arial" w:hAnsi="Arial" w:cs="Arial"/>
-          <w:sz w:val="20"/>
-          <w:szCs w:val="20"/>
-        </w:rPr>
-      </w:pPr>
-      <w:r>
-        <w:rPr>
-          <w:rFonts w:ascii="Arial" w:hAnsi="Arial" w:cs="Arial"/>
-          <w:sz w:val="20"/>
-          <w:szCs w:val="20"/>
-        </w:rPr>
-        <w:t>__________________________________________________</w:t>
-      </w:r>
-    </w:p>
-    <w:p>
-      <w:pPr>
-        <w:spacing w:line="360" w:lineRule="auto"/>
-        <w:jc w:val="both"/>
-        <w:rPr>
-          <w:rFonts w:ascii="Arial" w:hAnsi="Arial" w:cs="Arial"/>
-          <w:sz w:val="20"/>
-          <w:szCs w:val="20"/>
-          <w:highlight w:val="yellow"/>
-        </w:rPr>
-      </w:pPr>
-      <w:r>
-        <w:rPr>
-          <w:rFonts w:ascii="Arial" w:hAnsi="Arial" w:cs="Arial"/>
-          <w:sz w:val="20"/>
-          <w:szCs w:val="20"/>
-          <w:highlight w:val="yellow"/>
-        </w:rPr>
-        <w:t>NOME DO DISCENTE</w:t>
       </w:r>
     </w:p>
     <w:p>
@@ -1920,18 +1993,219 @@
           <w:rFonts w:ascii="Arial" w:hAnsi="Arial" w:cs="Arial"/>
           <w:sz w:val="20"/>
           <w:szCs w:val="20"/>
+        </w:rPr>
+        <w:t xml:space="preserve">Arthur Henrique Figueiredo </w:t>
+      </w:r>
+      <w:proofErr w:type="spellStart"/>
+      <w:r>
+        <w:rPr>
+          <w:rFonts w:ascii="Arial" w:hAnsi="Arial" w:cs="Arial"/>
+          <w:sz w:val="20"/>
+          <w:szCs w:val="20"/>
+        </w:rPr>
+        <w:t>Cayres</w:t>
+      </w:r>
+      <w:proofErr w:type="spellEnd"/>
+      <w:r>
+        <w:rPr>
+          <w:rFonts w:ascii="Arial" w:hAnsi="Arial" w:cs="Arial"/>
+          <w:sz w:val="20"/>
+          <w:szCs w:val="20"/>
+        </w:rPr>
+        <w:t xml:space="preserve"> </w:t>
+      </w:r>
+      <w:proofErr w:type="spellStart"/>
+      <w:r>
+        <w:rPr>
+          <w:rFonts w:ascii="Arial" w:hAnsi="Arial" w:cs="Arial"/>
+          <w:sz w:val="20"/>
+          <w:szCs w:val="20"/>
+        </w:rPr>
+        <w:t>Burdignon</w:t>
+      </w:r>
+      <w:proofErr w:type="spellEnd"/>
+    </w:p>
+    <w:p>
+      <w:pPr>
+        <w:spacing w:line="360" w:lineRule="auto"/>
+        <w:jc w:val="both"/>
+        <w:rPr>
+          <w:rFonts w:ascii="Arial" w:hAnsi="Arial" w:cs="Arial"/>
+          <w:sz w:val="20"/>
+          <w:szCs w:val="20"/>
+        </w:rPr>
+      </w:pPr>
+      <w:r>
+        <w:rPr>
+          <w:rFonts w:ascii="Arial" w:hAnsi="Arial" w:cs="Arial"/>
+          <w:sz w:val="20"/>
+          <w:szCs w:val="20"/>
+        </w:rPr>
+        <w:t>__________________________________________________</w:t>
+      </w:r>
+    </w:p>
+    <w:p>
+      <w:pPr>
+        <w:spacing w:line="360" w:lineRule="auto"/>
+        <w:jc w:val="both"/>
+        <w:rPr>
+          <w:rFonts w:ascii="Arial" w:hAnsi="Arial" w:cs="Arial"/>
+          <w:sz w:val="20"/>
+          <w:szCs w:val="20"/>
+        </w:rPr>
+      </w:pPr>
+      <w:r>
+        <w:rPr>
+          <w:rFonts w:ascii="Arial" w:hAnsi="Arial" w:cs="Arial"/>
+          <w:sz w:val="20"/>
+          <w:szCs w:val="20"/>
+        </w:rPr>
+        <w:t xml:space="preserve">Arthur </w:t>
+      </w:r>
+      <w:proofErr w:type="spellStart"/>
+      <w:r>
+        <w:rPr>
+          <w:rFonts w:ascii="Arial" w:hAnsi="Arial" w:cs="Arial"/>
+          <w:sz w:val="20"/>
+          <w:szCs w:val="20"/>
+        </w:rPr>
+        <w:t>Jansen</w:t>
+      </w:r>
+      <w:proofErr w:type="spellEnd"/>
+      <w:r>
+        <w:rPr>
+          <w:rFonts w:ascii="Arial" w:hAnsi="Arial" w:cs="Arial"/>
+          <w:sz w:val="20"/>
+          <w:szCs w:val="20"/>
+        </w:rPr>
+        <w:t xml:space="preserve"> Oliveira</w:t>
+      </w:r>
+    </w:p>
+    <w:p>
+      <w:pPr>
+        <w:spacing w:line="360" w:lineRule="auto"/>
+        <w:jc w:val="both"/>
+        <w:rPr>
+          <w:rFonts w:ascii="Arial" w:hAnsi="Arial" w:cs="Arial"/>
+          <w:sz w:val="20"/>
+          <w:szCs w:val="20"/>
+        </w:rPr>
+      </w:pPr>
+      <w:r>
+        <w:rPr>
+          <w:rFonts w:ascii="Arial" w:hAnsi="Arial" w:cs="Arial"/>
+          <w:sz w:val="20"/>
+          <w:szCs w:val="20"/>
+        </w:rPr>
+        <w:t>__________________________________________________</w:t>
+      </w:r>
+    </w:p>
+    <w:p>
+      <w:pPr>
+        <w:spacing w:line="360" w:lineRule="auto"/>
+        <w:jc w:val="both"/>
+        <w:rPr>
+          <w:rFonts w:ascii="Arial" w:hAnsi="Arial" w:cs="Arial"/>
+          <w:sz w:val="20"/>
+          <w:szCs w:val="20"/>
           <w:highlight w:val="yellow"/>
         </w:rPr>
-        <w:t>NOME DO</w:t>
-      </w:r>
-      <w:r>
+      </w:pPr>
+      <w:r>
+        <w:rPr>
+          <w:rFonts w:ascii="Arial" w:hAnsi="Arial" w:cs="Arial"/>
+          <w:sz w:val="20"/>
+          <w:szCs w:val="20"/>
+        </w:rPr>
+        <w:t>Bruna Pedrosa Nunes</w:t>
+      </w:r>
+    </w:p>
+    <w:p>
+      <w:pPr>
+        <w:spacing w:line="360" w:lineRule="auto"/>
+        <w:jc w:val="both"/>
+        <w:rPr>
+          <w:rFonts w:ascii="Arial" w:hAnsi="Arial" w:cs="Arial"/>
+          <w:sz w:val="20"/>
+          <w:szCs w:val="20"/>
+        </w:rPr>
+      </w:pPr>
+      <w:r>
+        <w:rPr>
+          <w:rFonts w:ascii="Arial" w:hAnsi="Arial" w:cs="Arial"/>
+          <w:sz w:val="20"/>
+          <w:szCs w:val="20"/>
+        </w:rPr>
+        <w:t>__________________________________________________</w:t>
+      </w:r>
+    </w:p>
+    <w:p>
+      <w:pPr>
+        <w:spacing w:line="360" w:lineRule="auto"/>
+        <w:jc w:val="both"/>
         <w:rPr>
           <w:rFonts w:ascii="Arial" w:hAnsi="Arial" w:cs="Arial"/>
           <w:sz w:val="20"/>
           <w:szCs w:val="20"/>
           <w:highlight w:val="yellow"/>
         </w:rPr>
-        <w:t xml:space="preserve"> DISCENTE</w:t>
+      </w:pPr>
+      <w:r>
+        <w:rPr>
+          <w:rFonts w:ascii="Arial" w:hAnsi="Arial" w:cs="Arial"/>
+          <w:sz w:val="20"/>
+          <w:szCs w:val="20"/>
+        </w:rPr>
+        <w:t xml:space="preserve">Lucas Gonçalves </w:t>
+      </w:r>
+      <w:proofErr w:type="spellStart"/>
+      <w:r>
+        <w:rPr>
+          <w:rFonts w:ascii="Arial" w:hAnsi="Arial" w:cs="Arial"/>
+          <w:sz w:val="20"/>
+          <w:szCs w:val="20"/>
+        </w:rPr>
+        <w:t>Sivolella</w:t>
+      </w:r>
+      <w:proofErr w:type="spellEnd"/>
+    </w:p>
+    <w:p>
+      <w:pPr>
+        <w:spacing w:line="360" w:lineRule="auto"/>
+        <w:jc w:val="both"/>
+        <w:rPr>
+          <w:rFonts w:ascii="Arial" w:hAnsi="Arial" w:cs="Arial"/>
+          <w:sz w:val="20"/>
+          <w:szCs w:val="20"/>
+        </w:rPr>
+      </w:pPr>
+      <w:r>
+        <w:rPr>
+          <w:rFonts w:ascii="Arial" w:hAnsi="Arial" w:cs="Arial"/>
+          <w:sz w:val="20"/>
+          <w:szCs w:val="20"/>
+        </w:rPr>
+        <w:t>__________________________________________________</w:t>
+      </w:r>
+    </w:p>
+    <w:p>
+      <w:pPr>
+        <w:spacing w:line="360" w:lineRule="auto"/>
+        <w:jc w:val="both"/>
+        <w:rPr>
+          <w:rFonts w:ascii="Arial" w:hAnsi="Arial" w:cs="Arial"/>
+          <w:sz w:val="20"/>
+          <w:szCs w:val="20"/>
+          <w:highlight w:val="yellow"/>
+        </w:rPr>
+      </w:pPr>
+      <w:r>
+        <w:rPr>
+          <w:rFonts w:ascii="Arial" w:hAnsi="Arial" w:cs="Arial"/>
+          <w:sz w:val="20"/>
+          <w:szCs w:val="20"/>
+        </w:rPr>
+        <w:t>Vinicius Ramos Sales</w:t>
       </w:r>
     </w:p>
     <w:p>
@@ -1955,30 +2229,6 @@
           <w:szCs w:val="20"/>
         </w:rPr>
       </w:pPr>
-      <w:r>
-        <w:rPr>
-          <w:rFonts w:ascii="Arial" w:hAnsi="Arial" w:cs="Arial"/>
-          <w:sz w:val="20"/>
-          <w:szCs w:val="20"/>
-        </w:rPr>
-        <w:t>_____________________________</w:t>
-      </w:r>
-      <w:r>
-        <w:rPr>
-          <w:rFonts w:ascii="Arial" w:hAnsi="Arial" w:cs="Arial"/>
-          <w:sz w:val="20"/>
-          <w:szCs w:val="20"/>
-        </w:rPr>
-        <w:t>____</w:t>
-      </w:r>
-      <w:r>
-        <w:rPr>
-          <w:rFonts w:ascii="Arial" w:hAnsi="Arial" w:cs="Arial"/>
-          <w:sz w:val="20"/>
-          <w:szCs w:val="20"/>
-        </w:rPr>
-        <w:t xml:space="preserve">                          </w:t>
-      </w:r>
     </w:p>
     <w:p>
       <w:pPr>
@@ -1988,17 +2238,79 @@
           <w:rFonts w:ascii="Arial" w:hAnsi="Arial" w:cs="Arial"/>
           <w:sz w:val="20"/>
           <w:szCs w:val="20"/>
+        </w:rPr>
+      </w:pPr>
+      <w:r>
+        <w:rPr>
+          <w:rFonts w:ascii="Arial" w:hAnsi="Arial" w:cs="Arial"/>
+          <w:sz w:val="20"/>
+          <w:szCs w:val="20"/>
+        </w:rPr>
+        <w:t>_____________________________</w:t>
+      </w:r>
+      <w:r>
+        <w:rPr>
+          <w:rFonts w:ascii="Arial" w:hAnsi="Arial" w:cs="Arial"/>
+          <w:sz w:val="20"/>
+          <w:szCs w:val="20"/>
+        </w:rPr>
+        <w:t>____</w:t>
+      </w:r>
+      <w:r>
+        <w:rPr>
+          <w:rFonts w:ascii="Arial" w:hAnsi="Arial" w:cs="Arial"/>
+          <w:sz w:val="20"/>
+          <w:szCs w:val="20"/>
+        </w:rPr>
+        <w:t xml:space="preserve">                          </w:t>
+      </w:r>
+    </w:p>
+    <w:p>
+      <w:pPr>
+        <w:spacing w:line="360" w:lineRule="auto"/>
+        <w:jc w:val="both"/>
+        <w:rPr>
+          <w:rFonts w:ascii="Arial" w:hAnsi="Arial" w:cs="Arial"/>
+          <w:sz w:val="20"/>
+          <w:szCs w:val="20"/>
           <w:highlight w:val="yellow"/>
         </w:rPr>
       </w:pPr>
-      <w:r>
-        <w:rPr>
-          <w:rFonts w:ascii="Arial" w:hAnsi="Arial" w:cs="Arial"/>
-          <w:sz w:val="20"/>
-          <w:szCs w:val="20"/>
-          <w:highlight w:val="yellow"/>
-        </w:rPr>
-        <w:t>NOME DO DOCENTE</w:t>
+      <w:proofErr w:type="spellStart"/>
+      <w:r>
+        <w:rPr>
+          <w:rFonts w:ascii="Arial" w:hAnsi="Arial" w:cs="Arial"/>
+          <w:sz w:val="20"/>
+          <w:szCs w:val="20"/>
+        </w:rPr>
+        <w:t>Cleia</w:t>
+      </w:r>
+      <w:proofErr w:type="spellEnd"/>
+      <w:r>
+        <w:rPr>
+          <w:rFonts w:ascii="Arial" w:hAnsi="Arial" w:cs="Arial"/>
+          <w:sz w:val="20"/>
+          <w:szCs w:val="20"/>
+        </w:rPr>
+        <w:t xml:space="preserve"> </w:t>
+      </w:r>
+      <w:proofErr w:type="spellStart"/>
+      <w:r>
+        <w:rPr>
+          <w:rFonts w:ascii="Arial" w:hAnsi="Arial" w:cs="Arial"/>
+          <w:sz w:val="20"/>
+          <w:szCs w:val="20"/>
+        </w:rPr>
+        <w:t>Marcia</w:t>
+      </w:r>
+      <w:proofErr w:type="spellEnd"/>
+      <w:r>
+        <w:rPr>
+          <w:rFonts w:ascii="Arial" w:hAnsi="Arial" w:cs="Arial"/>
+          <w:sz w:val="20"/>
+          <w:szCs w:val="20"/>
+        </w:rPr>
+        <w:t xml:space="preserve"> Gomes Amaral</w:t>
       </w:r>
     </w:p>
     <w:p>
@@ -2047,33 +2359,9 @@
           <w:rFonts w:ascii="Arial" w:hAnsi="Arial" w:cs="Arial"/>
           <w:sz w:val="20"/>
           <w:szCs w:val="20"/>
-          <w:highlight w:val="yellow"/>
-        </w:rPr>
-        <w:t>NOME DO DOCENTE</w:t>
-      </w:r>
-    </w:p>
-    <w:p>
-      <w:pPr>
-        <w:spacing w:line="360" w:lineRule="auto"/>
-        <w:jc w:val="both"/>
-        <w:rPr>
-          <w:rFonts w:ascii="Arial" w:hAnsi="Arial" w:cs="Arial"/>
-          <w:sz w:val="20"/>
-          <w:szCs w:val="20"/>
-        </w:rPr>
-      </w:pPr>
-    </w:p>
-    <w:p>
-      <w:pPr>
-        <w:spacing w:line="360" w:lineRule="auto"/>
-        <w:jc w:val="both"/>
-        <w:rPr>
-          <w:rFonts w:ascii="Arial" w:hAnsi="Arial" w:cs="Arial"/>
-          <w:sz w:val="20"/>
-          <w:szCs w:val="20"/>
-          <w:highlight w:val="yellow"/>
-        </w:rPr>
-      </w:pPr>
+        </w:rPr>
+        <w:t>Joana Gabriela Ribeiro de Souza</w:t>
+      </w:r>
       <w:bookmarkStart w:id="0" w:name="_GoBack"/>
       <w:bookmarkEnd w:id="0"/>
     </w:p>
@@ -2088,7 +2376,7 @@
 </file>
 
 <file path=word/styles.xml><?xml version="1.0" encoding="utf-8"?>
-<w:styles xmlns:mc="http://schemas.openxmlformats.org/markup-compatibility/2006" xmlns:r="http://schemas.openxmlformats.org/officeDocument/2006/relationships" xmlns:w="http://schemas.openxmlformats.org/wordprocessingml/2006/main" xmlns:w14="http://schemas.microsoft.com/office/word/2010/wordml" mc:Ignorable="w14">
+<w:styles xmlns:r="http://schemas.openxmlformats.org/officeDocument/2006/relationships" xmlns:w="http://schemas.openxmlformats.org/wordprocessingml/2006/main">
   <w:docDefaults>
     <w:rPrDefault>
       <w:rPr>
@@ -2098,7 +2386,7 @@
     </w:rPrDefault>
     <w:pPrDefault/>
   </w:docDefaults>
-  <w:latentStyles w:defLockedState="0" w:defUIPriority="0" w:defSemiHidden="0" w:defUnhideWhenUsed="0" w:defQFormat="0" w:count="276">
+  <w:latentStyles w:defLockedState="0" w:defUIPriority="0" w:defSemiHidden="0" w:defUnhideWhenUsed="0" w:defQFormat="0" w:count="267">
     <w:lsdException w:name="Normal" w:qFormat="1"/>
     <w:lsdException w:name="heading 1" w:qFormat="1"/>
     <w:lsdException w:name="heading 2" w:semiHidden="1" w:unhideWhenUsed="1" w:qFormat="1"/>
@@ -2273,23 +2561,25 @@
   <w:style w:type="paragraph" w:default="1" w:styleId="Normal">
     <w:name w:val="Normal"/>
     <w:qFormat/>
+    <w:rsid w:val="00707295"/>
     <w:rPr>
       <w:sz w:val="24"/>
       <w:szCs w:val="24"/>
       <w:lang w:eastAsia="pt-BR"/>
     </w:rPr>
   </w:style>
-  <w:style w:type="character" w:default="1" w:styleId="DefaultParagraphFont">
+  <w:style w:type="character" w:default="1" w:styleId="Fontepargpadro">
     <w:name w:val="Default Paragraph Font"/>
     <w:uiPriority w:val="1"/>
     <w:semiHidden/>
     <w:unhideWhenUsed/>
   </w:style>
-  <w:style w:type="table" w:default="1" w:styleId="TableNormal">
+  <w:style w:type="table" w:default="1" w:styleId="Tabelanormal">
     <w:name w:val="Normal Table"/>
     <w:uiPriority w:val="99"/>
     <w:semiHidden/>
     <w:unhideWhenUsed/>
+    <w:qFormat/>
     <w:tblPr>
       <w:tblInd w:w="0" w:type="dxa"/>
       <w:tblCellMar>
@@ -2300,7 +2590,7 @@
       </w:tblCellMar>
     </w:tblPr>
   </w:style>
-  <w:style w:type="numbering" w:default="1" w:styleId="NoList">
+  <w:style w:type="numbering" w:default="1" w:styleId="Semlista">
     <w:name w:val="No List"/>
     <w:uiPriority w:val="99"/>
     <w:semiHidden/>
@@ -2820,7 +3110,7 @@
   <a:extraClrSchemeLst/>
   <a:extLst>
     <a:ext uri="{05A4C25C-085E-4340-85A3-A5531E510DB2}">
-      <thm15:themeFamily xmlns:thm15="http://schemas.microsoft.com/office/thememl/2012/main" xmlns="" name="Office Theme" id="{62F939B6-93AF-4DB8-9C6B-D6C7DFDC589F}" vid="{4A3C46E8-61CC-4603-A589-7422A47A8E4A}"/>
+      <thm15:themeFamily xmlns="" xmlns:thm15="http://schemas.microsoft.com/office/thememl/2012/main" name="Office Theme" id="{62F939B6-93AF-4DB8-9C6B-D6C7DFDC589F}" vid="{4A3C46E8-61CC-4603-A589-7422A47A8E4A}"/>
     </a:ext>
   </a:extLst>
 </a:theme>

</xml_diff>